<commit_message>
refactoring and improved cover letters
</commit_message>
<xml_diff>
--- a/output/coverletters/gh_cover_7875686.docx
+++ b/output/coverletters/gh_cover_7875686.docx
@@ -4,17 +4,17 @@
   <w:body>
     <w:p>
       <w:r>
-        <w:t>I am excited to apply for the AI Engineer position at YipitData. My M.S. in Computer Science with a focus on AI and Machine Learning provides me with a solid foundation in software engineering and a passion for developing impactful systems. The opportunity to work at a leading market research firm that analyzes billions of data points aligns perfectly with my skills in automating workflows and building predictive models.</w:t>
+        <w:t>I am excited to apply for the AI Engineer position at YipitData. With a Master's in Computer Science and experience in developing data-driven systems and automation tools, I believe my background aligns perfectly with YipitData's mission to transform alternative data into actionable insights. My skills in Python and machine learning have equipped me with the tools necessary to contribute to impactful projects that drive strategic decisions.</w:t>
       </w:r>
     </w:p>
     <w:p>
       <w:r>
-        <w:t>During my academic career, I developed projects where I integrated various data components and designed predictive models, skills that align directly with YipitData's mission. By leveraging tools like Python and machine learning frameworks, I have been able to build systems that turn complex data into actionable insights, demonstrating my readiness to own high-impact projects in your fast-paced environment.</w:t>
+        <w:t>In my previous work, I successfully built predictive models and optimized AI architectures, which resulted in significantly improved operational efficiencies. I have collaborated in team environments, implementing scalable applications that integrate diverse data formats while prioritizing clean, testable code-key attributes necessary for the fast-paced environment at YipitData.</w:t>
       </w:r>
     </w:p>
     <w:p>
       <w:r>
-        <w:t>I am particularly drawn to YipitData’s emphasis on ownership, growth, and innovation. I look forward to the possibility of contributing to your data science team and shaping AI-native workflows that support strategic decision-making for your clients. Thank you for considering my application; I am eager to discuss how my background can benefit YipitData.</w:t>
+        <w:t>I am particularly drawn to YipitData's commitment to innovation and ownership in impactful projects. As part of your team, I am eager to leverage my expertise to engineer features and build models that enhance data analysis capabilities. I welcome the opportunity to discuss how my background and skills can contribute to YipitData’s continued success.</w:t>
       </w:r>
     </w:p>
     <w:sectPr>

</xml_diff>